<commit_message>
Update Sprint 1 Week 2 Notulen.docx
</commit_message>
<xml_diff>
--- a/Documentatie/Sprint 1 Week 2 Notulen.docx
+++ b/Documentatie/Sprint 1 Week 2 Notulen.docx
@@ -24,25 +24,6 @@
           <w:lang w:val="nl-NL"/>
         </w:rPr>
         <w:t>Sprint 1 Week 2 Notulen</w:t>
-      </w:r>
-    </w:p>
-    <w:p>
-      <w:pPr>
-        <w:rPr>
-          <w:lang w:val="nl-NL"/>
-        </w:rPr>
-      </w:pPr>
-      <w:r>
-        <w:rPr>
-          <w:lang w:val="nl-NL"/>
-        </w:rPr>
-        <w:t>Powerpoint samenvatting over wat er g</w:t>
-      </w:r>
-      <w:r>
-        <w:rPr>
-          <w:lang w:val="nl-NL"/>
-        </w:rPr>
-        <w:t>aat gebeuren.</w:t>
       </w:r>
     </w:p>
     <w:p>

</xml_diff>